<commit_message>
Update notebooks and Assignment 1 instructions
Point students to the .docx instructions in both notebooks, extend the
Assignment 1 simulation duration to 15 minutes, and refresh the
instructions document.

Co-Authored-By: Claude Sonnet 5.5 <noreply@anthropic.com>
</commit_message>
<xml_diff>
--- a/TFM_2026_Assignment_1_instructions.docx
+++ b/TFM_2026_Assignment_1_instructions.docx
@@ -63,11 +63,9 @@
       <w:r>
         <w:t xml:space="preserve">You are given a circular road network, </w:t>
       </w:r>
-      <w:proofErr w:type="gramStart"/>
       <w:r>
         <w:t>similar to</w:t>
       </w:r>
-      <w:proofErr w:type="gramEnd"/>
       <w:r>
         <w:t xml:space="preserve"> the one </w:t>
       </w:r>
@@ -91,10 +89,10 @@
           <w:noProof/>
         </w:rPr>
         <w:drawing>
-          <wp:inline distT="0" distB="0" distL="0" distR="0" wp14:anchorId="2C11CCB0" wp14:editId="24AE1774">
-            <wp:extent cx="6078511" cy="4065979"/>
-            <wp:effectExtent l="0" t="0" r="5080" b="0"/>
-            <wp:docPr id="1447637028" name="Picture 1"/>
+          <wp:inline distT="0" distB="0" distL="0" distR="0" wp14:anchorId="1C7122EF" wp14:editId="256E3086">
+            <wp:extent cx="5943600" cy="3310890"/>
+            <wp:effectExtent l="0" t="0" r="0" b="3810"/>
+            <wp:docPr id="1292350814" name="Picture 1"/>
             <wp:cNvGraphicFramePr>
               <a:graphicFrameLocks xmlns:a="http://schemas.openxmlformats.org/drawingml/2006/main" noChangeAspect="1"/>
             </wp:cNvGraphicFramePr>
@@ -102,7 +100,7 @@
               <a:graphicData uri="http://schemas.openxmlformats.org/drawingml/2006/picture">
                 <pic:pic xmlns:pic="http://schemas.openxmlformats.org/drawingml/2006/picture">
                   <pic:nvPicPr>
-                    <pic:cNvPr id="1447637028" name="Picture 1447637028"/>
+                    <pic:cNvPr id="1292350814" name="Picture 1292350814"/>
                     <pic:cNvPicPr/>
                   </pic:nvPicPr>
                   <pic:blipFill>
@@ -120,7 +118,7 @@
                   <pic:spPr>
                     <a:xfrm>
                       <a:off x="0" y="0"/>
-                      <a:ext cx="6153078" cy="4115857"/>
+                      <a:ext cx="5943600" cy="3310890"/>
                     </a:xfrm>
                     <a:prstGeom prst="rect">
                       <a:avLst/>
@@ -176,6 +174,30 @@
         <w:t>a total length of 628m</w:t>
       </w:r>
     </w:p>
+    <w:p>
+      <w:pPr>
+        <w:pStyle w:val="ListParagraph"/>
+        <w:numPr>
+          <w:ilvl w:val="0"/>
+          <w:numId w:val="1"/>
+        </w:numPr>
+      </w:pPr>
+      <w:r>
+        <w:t>an onramp from which vehicles can enter the circle</w:t>
+      </w:r>
+    </w:p>
+    <w:p>
+      <w:pPr>
+        <w:pStyle w:val="ListParagraph"/>
+        <w:numPr>
+          <w:ilvl w:val="0"/>
+          <w:numId w:val="1"/>
+        </w:numPr>
+      </w:pPr>
+      <w:r>
+        <w:t>no offramp, so vehicles must remain in the circle once entering</w:t>
+      </w:r>
+    </w:p>
     <w:p/>
     <w:p>
       <w:r>
@@ -196,10 +218,24 @@
     </w:p>
     <w:p/>
     <w:p/>
+    <w:p/>
+    <w:p/>
     <w:p>
       <w:r>
         <w:lastRenderedPageBreak/>
-        <w:t>Once installation is successful, you will be presented with the following interface:</w:t>
+        <w:t xml:space="preserve">Once installation </w:t>
+      </w:r>
+      <w:r>
+        <w:t>and launching are</w:t>
+      </w:r>
+      <w:r>
+        <w:t xml:space="preserve"> successful, </w:t>
+      </w:r>
+      <w:r>
+        <w:t xml:space="preserve">click on ‘Assignment 1’, after which </w:t>
+      </w:r>
+      <w:r>
+        <w:t>you will be presented with the following interface:</w:t>
       </w:r>
     </w:p>
     <w:p/>
@@ -209,10 +245,10 @@
           <w:noProof/>
         </w:rPr>
         <w:drawing>
-          <wp:inline distT="0" distB="0" distL="0" distR="0" wp14:anchorId="5DA9A95F" wp14:editId="08A64C78">
-            <wp:extent cx="5943600" cy="4364355"/>
-            <wp:effectExtent l="0" t="0" r="0" b="4445"/>
-            <wp:docPr id="827123111" name="Picture 2"/>
+          <wp:inline distT="0" distB="0" distL="0" distR="0" wp14:anchorId="6127BA24" wp14:editId="08BB466A">
+            <wp:extent cx="5943600" cy="3194685"/>
+            <wp:effectExtent l="0" t="0" r="0" b="5715"/>
+            <wp:docPr id="1209071309" name="Picture 2"/>
             <wp:cNvGraphicFramePr>
               <a:graphicFrameLocks xmlns:a="http://schemas.openxmlformats.org/drawingml/2006/main" noChangeAspect="1"/>
             </wp:cNvGraphicFramePr>
@@ -220,7 +256,7 @@
               <a:graphicData uri="http://schemas.openxmlformats.org/drawingml/2006/picture">
                 <pic:pic xmlns:pic="http://schemas.openxmlformats.org/drawingml/2006/picture">
                   <pic:nvPicPr>
-                    <pic:cNvPr id="827123111" name="Picture 827123111"/>
+                    <pic:cNvPr id="1209071309" name="Picture 1209071309"/>
                     <pic:cNvPicPr/>
                   </pic:nvPicPr>
                   <pic:blipFill>
@@ -238,7 +274,7 @@
                   <pic:spPr>
                     <a:xfrm>
                       <a:off x="0" y="0"/>
-                      <a:ext cx="5943600" cy="4364355"/>
+                      <a:ext cx="5943600" cy="3194685"/>
                     </a:xfrm>
                     <a:prstGeom prst="rect">
                       <a:avLst/>
@@ -262,19 +298,11 @@
       <w:r>
         <w:t xml:space="preserve"> side, you see a few parameters, all related to the </w:t>
       </w:r>
-      <w:proofErr w:type="spellStart"/>
       <w:r>
         <w:rPr>
           <w:u w:val="single"/>
         </w:rPr>
-        <w:t>Krauß</w:t>
-      </w:r>
-      <w:proofErr w:type="spellEnd"/>
-      <w:r>
-        <w:rPr>
-          <w:u w:val="single"/>
-        </w:rPr>
-        <w:t xml:space="preserve"> car following model</w:t>
+        <w:t>Krauß car following model</w:t>
       </w:r>
       <w:r>
         <w:t>, discussed in class. You can also change the total demand (</w:t>
@@ -319,7 +347,13 @@
         <w:t>below</w:t>
       </w:r>
       <w:r>
-        <w:t xml:space="preserve"> (more simulation outputs are not visible here)</w:t>
+        <w:t xml:space="preserve"> (more simulation outputs are not visible here</w:t>
+      </w:r>
+      <w:r>
+        <w:t>, just scroll down!</w:t>
+      </w:r>
+      <w:r>
+        <w:t>)</w:t>
       </w:r>
       <w:r>
         <w:t>.</w:t>
@@ -327,16 +361,21 @@
     </w:p>
     <w:p/>
     <w:p>
-      <w:r>
+      <w:pPr>
+        <w:jc w:val="center"/>
         <w:rPr>
           <w:noProof/>
         </w:rPr>
-        <w:lastRenderedPageBreak/>
+      </w:pPr>
+      <w:r>
+        <w:rPr>
+          <w:noProof/>
+        </w:rPr>
         <w:drawing>
-          <wp:inline distT="0" distB="0" distL="0" distR="0" wp14:anchorId="650A8062" wp14:editId="403C7E86">
-            <wp:extent cx="5908675" cy="8229600"/>
+          <wp:inline distT="0" distB="0" distL="0" distR="0" wp14:anchorId="16B36CC3" wp14:editId="7B224A79">
+            <wp:extent cx="5233481" cy="2807405"/>
             <wp:effectExtent l="0" t="0" r="0" b="0"/>
-            <wp:docPr id="1494037903" name="Picture 3"/>
+            <wp:docPr id="1316898334" name="Picture 3"/>
             <wp:cNvGraphicFramePr>
               <a:graphicFrameLocks xmlns:a="http://schemas.openxmlformats.org/drawingml/2006/main" noChangeAspect="1"/>
             </wp:cNvGraphicFramePr>
@@ -344,7 +383,7 @@
               <a:graphicData uri="http://schemas.openxmlformats.org/drawingml/2006/picture">
                 <pic:pic xmlns:pic="http://schemas.openxmlformats.org/drawingml/2006/picture">
                   <pic:nvPicPr>
-                    <pic:cNvPr id="1494037903" name="Picture 1494037903"/>
+                    <pic:cNvPr id="1316898334" name="Picture 1316898334"/>
                     <pic:cNvPicPr/>
                   </pic:nvPicPr>
                   <pic:blipFill>
@@ -362,7 +401,7 @@
                   <pic:spPr>
                     <a:xfrm>
                       <a:off x="0" y="0"/>
-                      <a:ext cx="5908675" cy="8229600"/>
+                      <a:ext cx="5273073" cy="2828644"/>
                     </a:xfrm>
                     <a:prstGeom prst="rect">
                       <a:avLst/>
@@ -376,6 +415,12 @@
       </w:r>
     </w:p>
     <w:p>
+      <w:pPr>
+        <w:rPr>
+          <w:b/>
+          <w:bCs/>
+        </w:rPr>
+      </w:pPr>
       <w:r>
         <w:lastRenderedPageBreak/>
         <w:t xml:space="preserve">Assignment 1 </w:t>
@@ -397,6 +442,7 @@
         <w:t>two tasks:</w:t>
       </w:r>
     </w:p>
+    <w:p/>
     <w:p>
       <w:pPr>
         <w:pStyle w:val="ListParagraph"/>
@@ -409,30 +455,31 @@
         <w:rPr>
           <w:u w:val="single"/>
         </w:rPr>
-        <w:t xml:space="preserve">Tune the parameters of the </w:t>
-      </w:r>
-      <w:proofErr w:type="spellStart"/>
+        <w:t>Tune the parameters of the Krauß car-following model</w:t>
+      </w:r>
+      <w:r>
+        <w:t xml:space="preserve">, trying to replicate the behavior that was observed in real life, i.e. </w:t>
+      </w:r>
       <w:r>
         <w:rPr>
           <w:u w:val="single"/>
         </w:rPr>
-        <w:t>Krauß</w:t>
-      </w:r>
-      <w:proofErr w:type="spellEnd"/>
+        <w:t xml:space="preserve">the </w:t>
+      </w:r>
       <w:r>
         <w:rPr>
           <w:u w:val="single"/>
         </w:rPr>
-        <w:t xml:space="preserve"> car-following model</w:t>
-      </w:r>
-      <w:r>
-        <w:t xml:space="preserve">, trying to replicate the behavior that was observed in real life, i.e. the </w:t>
-      </w:r>
-      <w:r>
         <w:t>appearance</w:t>
       </w:r>
       <w:r>
-        <w:t xml:space="preserve"> of ‘phantom’ jams.</w:t>
+        <w:rPr>
+          <w:u w:val="single"/>
+        </w:rPr>
+        <w:t xml:space="preserve"> of ‘phantom’ jams</w:t>
+      </w:r>
+      <w:r>
+        <w:t>.</w:t>
       </w:r>
       <w:r>
         <w:t xml:space="preserve"> You can change one or more </w:t>
@@ -441,7 +488,15 @@
         <w:t>parameters;</w:t>
       </w:r>
       <w:r>
-        <w:t xml:space="preserve"> it is recommended that you do so in a structured manner. Try to answer the following questions:</w:t>
+        <w:t xml:space="preserve"> it is recommended that you do so in a structured manner. </w:t>
+      </w:r>
+    </w:p>
+    <w:p>
+      <w:pPr>
+        <w:pStyle w:val="ListParagraph"/>
+      </w:pPr>
+      <w:r>
+        <w:t>Try to answer the following questions:</w:t>
       </w:r>
     </w:p>
     <w:p>
@@ -453,10 +508,19 @@
         </w:numPr>
       </w:pPr>
       <w:r>
-        <w:t xml:space="preserve">Which parameters led to phantom jams? Which combinations? </w:t>
-      </w:r>
-      <w:r>
-        <w:t>Which parameters are a necessary condition? Which ones are irrelevant?</w:t>
+        <w:t xml:space="preserve">What is the smallest </w:t>
+      </w:r>
+      <w:r>
+        <w:t xml:space="preserve">total demand </w:t>
+      </w:r>
+      <w:r>
+        <w:t>that still leads to phantom jams</w:t>
+      </w:r>
+      <w:r>
+        <w:t>?</w:t>
+      </w:r>
+      <w:r>
+        <w:t xml:space="preserve"> </w:t>
       </w:r>
     </w:p>
     <w:p>
@@ -468,10 +532,10 @@
         </w:numPr>
       </w:pPr>
       <w:r>
-        <w:t>What can you observe in the model outputs? How do phantom jams affect space-time diagrams, trajectory plots, …</w:t>
-      </w:r>
-      <w:r>
-        <w:t>?</w:t>
+        <w:t xml:space="preserve">Which parameters led to phantom jams? Which combinations? </w:t>
+      </w:r>
+      <w:r>
+        <w:t>Which parameters are a necessary condition? Which ones are irrelevant?</w:t>
       </w:r>
     </w:p>
     <w:p>
@@ -483,9 +547,25 @@
         </w:numPr>
       </w:pPr>
       <w:r>
+        <w:t>What can you observe in the model outputs? How do phantom jams affect space-time diagrams, trajectory plots, …</w:t>
+      </w:r>
+      <w:r>
+        <w:t>?</w:t>
+      </w:r>
+    </w:p>
+    <w:p>
+      <w:pPr>
+        <w:pStyle w:val="ListParagraph"/>
+        <w:numPr>
+          <w:ilvl w:val="1"/>
+          <w:numId w:val="7"/>
+        </w:numPr>
+      </w:pPr>
+      <w:r>
         <w:t>How did you choose the parameters and their values? How does this relate to the classroom materials?</w:t>
       </w:r>
     </w:p>
+    <w:p/>
     <w:p>
       <w:pPr>
         <w:pStyle w:val="ListParagraph"/>
@@ -510,7 +590,32 @@
         <w:t xml:space="preserve"> the flow-density Fundamental Diagram</w:t>
       </w:r>
       <w:r>
-        <w:t xml:space="preserve"> for this circular road. You may use the triangular approximation. Try to answer the following questions:</w:t>
+        <w:t xml:space="preserve"> for this circular road. You may use the triangular approximation. </w:t>
+      </w:r>
+      <w:r>
+        <w:rPr>
+          <w:b/>
+          <w:bCs/>
+        </w:rPr>
+        <w:t>HINT</w:t>
+      </w:r>
+      <w:r>
+        <w:t xml:space="preserve">: </w:t>
+      </w:r>
+      <w:r>
+        <w:t>Try to answer the following questions</w:t>
+      </w:r>
+      <w:r>
+        <w:t xml:space="preserve"> for yourself</w:t>
+      </w:r>
+      <w:r>
+        <w:t xml:space="preserve">, </w:t>
+      </w:r>
+      <w:r>
+        <w:t>to get started</w:t>
+      </w:r>
+      <w:r>
+        <w:t>:</w:t>
       </w:r>
     </w:p>
     <w:p>
@@ -525,7 +630,97 @@
         <w:t xml:space="preserve">What are the values for the following </w:t>
       </w:r>
       <w:r>
-        <w:t>key variables? Free-flow speed, capacity, jam density, critical density, maximum back-propagation wave speed?</w:t>
+        <w:t xml:space="preserve">key variables? </w:t>
+      </w:r>
+    </w:p>
+    <w:p>
+      <w:pPr>
+        <w:pStyle w:val="ListParagraph"/>
+        <w:numPr>
+          <w:ilvl w:val="2"/>
+          <w:numId w:val="7"/>
+        </w:numPr>
+      </w:pPr>
+      <w:r>
+        <w:t>Free-flow speed</w:t>
+      </w:r>
+    </w:p>
+    <w:p>
+      <w:pPr>
+        <w:pStyle w:val="ListParagraph"/>
+        <w:numPr>
+          <w:ilvl w:val="2"/>
+          <w:numId w:val="7"/>
+        </w:numPr>
+      </w:pPr>
+      <w:r>
+        <w:t>C</w:t>
+      </w:r>
+      <w:r>
+        <w:t>apacity</w:t>
+      </w:r>
+    </w:p>
+    <w:p>
+      <w:pPr>
+        <w:pStyle w:val="ListParagraph"/>
+        <w:numPr>
+          <w:ilvl w:val="2"/>
+          <w:numId w:val="7"/>
+        </w:numPr>
+      </w:pPr>
+      <w:r>
+        <w:t>jam density</w:t>
+      </w:r>
+    </w:p>
+    <w:p>
+      <w:pPr>
+        <w:pStyle w:val="ListParagraph"/>
+        <w:numPr>
+          <w:ilvl w:val="2"/>
+          <w:numId w:val="7"/>
+        </w:numPr>
+      </w:pPr>
+      <w:r>
+        <w:t>critical density</w:t>
+      </w:r>
+    </w:p>
+    <w:p>
+      <w:pPr>
+        <w:pStyle w:val="ListParagraph"/>
+        <w:numPr>
+          <w:ilvl w:val="2"/>
+          <w:numId w:val="7"/>
+        </w:numPr>
+      </w:pPr>
+      <w:r>
+        <w:t>maximum back-propagation wave speed</w:t>
+      </w:r>
+    </w:p>
+    <w:p>
+      <w:pPr>
+        <w:ind w:left="1440"/>
+      </w:pPr>
+      <w:r>
+        <w:rPr>
+          <w:b/>
+          <w:bCs/>
+        </w:rPr>
+        <w:t>HINT</w:t>
+      </w:r>
+      <w:r>
+        <w:t>: not all of these can be observed from (simulated) experiments.</w:t>
+      </w:r>
+      <w:r>
+        <w:t xml:space="preserve"> For some you </w:t>
+      </w:r>
+      <w:r>
+        <w:t>must</w:t>
+      </w:r>
+      <w:r>
+        <w:t xml:space="preserve"> use your </w:t>
+      </w:r>
+      <w:r>
+        <w:t>noggin...</w:t>
       </w:r>
     </w:p>
     <w:p>
@@ -544,24 +739,13 @@
       <w:pPr>
         <w:ind w:left="720"/>
       </w:pPr>
-      <w:r>
-        <w:t xml:space="preserve">You may freely choose how you draw the FD (python, excel, </w:t>
-      </w:r>
-      <w:proofErr w:type="gramStart"/>
-      <w:r>
-        <w:t>manually..</w:t>
-      </w:r>
-      <w:proofErr w:type="gramEnd"/>
-      <w:r>
-        <w:t xml:space="preserve">), </w:t>
-      </w:r>
-      <w:proofErr w:type="gramStart"/>
-      <w:r>
-        <w:t>as long as</w:t>
-      </w:r>
-      <w:proofErr w:type="gramEnd"/>
-      <w:r>
-        <w:t xml:space="preserve"> you identify the key variables and associated values.</w:t>
+    </w:p>
+    <w:p>
+      <w:pPr>
+        <w:ind w:left="720"/>
+      </w:pPr>
+      <w:r>
+        <w:t>You may freely choose how you draw the FD (python, excel, manually..), as long as you identify the key variables and associated values.</w:t>
       </w:r>
     </w:p>
     <w:p/>
@@ -585,15 +769,7 @@
         <w:t xml:space="preserve"> 1</w:t>
       </w:r>
       <w:r>
-        <w:t xml:space="preserve">, where you clearly outline the </w:t>
-      </w:r>
-      <w:proofErr w:type="gramStart"/>
-      <w:r>
-        <w:t>experiments</w:t>
-      </w:r>
-      <w:proofErr w:type="gramEnd"/>
-      <w:r>
-        <w:t xml:space="preserve"> you carried out and your experimental findings. </w:t>
+        <w:t xml:space="preserve">, where you clearly outline the experiments you carried out and your experimental findings. </w:t>
       </w:r>
       <w:r>
         <w:t>T</w:t>
@@ -605,7 +781,26 @@
         <w:t>count</w:t>
       </w:r>
       <w:r>
-        <w:t xml:space="preserve"> should not exceed 10 pages, excluding references. Be selective with how you present your findings.</w:t>
+        <w:t xml:space="preserve"> should not exceed 10 pages, excluding references</w:t>
+      </w:r>
+      <w:r>
+        <w:t>, title page and summary page</w:t>
+      </w:r>
+      <w:r>
+        <w:t xml:space="preserve"> (however </w:t>
+      </w:r>
+      <w:r>
+        <w:rPr>
+          <w:b/>
+          <w:bCs/>
+        </w:rPr>
+        <w:t>including</w:t>
+      </w:r>
+      <w:r>
+        <w:t xml:space="preserve"> figures, tables, …)</w:t>
+      </w:r>
+      <w:r>
+        <w:t>. Be selective with how you present your findings.</w:t>
       </w:r>
     </w:p>
     <w:p/>
@@ -676,13 +871,16 @@
       <w:t xml:space="preserve">-24 </w:t>
     </w:r>
     <w:r>
-      <w:t>26</w:t>
+      <w:t>2</w:t>
+    </w:r>
+    <w:r>
+      <w:t>7</w:t>
     </w:r>
     <w:r>
       <w:t>/2</w:t>
     </w:r>
     <w:r>
-      <w:t>7</w:t>
+      <w:t>8</w:t>
     </w:r>
     <w:r>
       <w:t xml:space="preserve"> – Exam assignment </w:t>
@@ -899,7 +1097,7 @@
         <w:ind w:left="1440" w:hanging="360"/>
       </w:pPr>
     </w:lvl>
-    <w:lvl w:ilvl="2" w:tplc="0409001B" w:tentative="1">
+    <w:lvl w:ilvl="2" w:tplc="0409001B">
       <w:start w:val="1"/>
       <w:numFmt w:val="lowerRoman"/>
       <w:lvlText w:val="%3."/>

</xml_diff>